<commit_message>
v0.1.0 finale: nouveau template, total auto, édition, splash
- Template Contrat_Lili comme référence (mise en forme native)
- Tableau ECUE avec ligne TOTAL auto-calculée (somme CM/TD/TP)
- Suppression du QR code dupliqué (du template original)
- Titres et signataires réduits à 10pt (économie d'espace pour QR)
- Format année académique 2025-2026 (avec tiret) partout
- Bouton Modifier dans l'historique (édition pré-remplie d'un contrat)
- Bouton Imprimer (ouvre PDF dans Aperçu/Adobe)
- Dossier de téléchargement par défaut + 'Enregistrer sous...'
- Splash screen au démarrage (ping API jusqu'à 20s)
- Fix processus API zombies (pkill au démarrage + à la fermeture)
- Page Paramètres (DG, arrêté, année, dossier, etc.)
- Import Excel .xlsx + téléchargement de modèles
</commit_message>
<xml_diff>
--- a/api/template_contrat.docx
+++ b/api/template_contrat.docx
@@ -99,6 +99,8 @@
       </w:pPr>
       <w:r>
         <w:rPr>
+          <w:sz w:val="20"/>
+          <w:szCs w:val="20"/>
           <w:b/>
         </w:rPr>
         <w:t xml:space="preserve">DIRECTION GENERALE </w:t>
@@ -111,6 +113,8 @@
       </w:pPr>
       <w:r>
         <w:rPr>
+          <w:sz w:val="20"/>
+          <w:szCs w:val="20"/>
           <w:b/>
         </w:rPr>
         <w:t xml:space="preserve">-=-=-=-=-=-=-=-    </w:t>
@@ -123,6 +127,8 @@
       </w:pPr>
       <w:r>
         <w:rPr>
+          <w:sz w:val="20"/>
+          <w:szCs w:val="20"/>
           <w:b/>
         </w:rPr>
         <w:t xml:space="preserve">SECRETARIAT GENERAL   </w:t>
@@ -138,12 +144,16 @@
       </w:pPr>
       <w:r>
         <w:rPr>
+          <w:sz w:val="20"/>
+          <w:szCs w:val="20"/>
           <w:b/>
         </w:rPr>
         <w:t>-=-=-=-=-=-=-=-</w:t>
       </w:r>
       <w:r>
         <w:rPr>
+          <w:sz w:val="20"/>
+          <w:szCs w:val="20"/>
           <w:b/>
         </w:rPr>
         <w:tab/>
@@ -160,12 +170,16 @@
       </w:pPr>
       <w:r>
         <w:rPr>
+          <w:sz w:val="20"/>
+          <w:szCs w:val="20"/>
           <w:b/>
         </w:rPr>
         <w:t xml:space="preserve">DIRECTION DES ETUDES </w:t>
       </w:r>
       <w:r>
         <w:rPr>
+          <w:sz w:val="20"/>
+          <w:szCs w:val="20"/>
           <w:b/>
         </w:rPr>
         <w:tab/>
@@ -177,11 +191,15 @@
         <w:spacing w:after="0" w:line="240" w:lineRule="auto"/>
         <w:ind w:left="0" w:right="0" w:firstLine="0"/>
         <w:rPr>
-          <w:b/>
-        </w:rPr>
-      </w:pPr>
-      <w:r>
-        <w:rPr>
+          <w:sz w:val="20"/>
+          <w:szCs w:val="20"/>
+          <w:b/>
+        </w:rPr>
+      </w:pPr>
+      <w:r>
+        <w:rPr>
+          <w:sz w:val="20"/>
+          <w:szCs w:val="20"/>
           <w:b/>
         </w:rPr>
         <w:t>-=-=-=-=-=-=-=-</w:t>
@@ -192,11 +210,15 @@
         <w:spacing w:line="240" w:lineRule="auto"/>
         <w:ind w:left="-5" w:right="0"/>
         <w:rPr>
-          <w:b/>
-        </w:rPr>
-      </w:pPr>
-      <w:r>
-        <w:rPr>
+          <w:sz w:val="20"/>
+          <w:szCs w:val="20"/>
+          <w:b/>
+        </w:rPr>
+      </w:pPr>
+      <w:r>
+        <w:rPr>
+          <w:sz w:val="20"/>
+          <w:szCs w:val="20"/>
           <w:b/>
         </w:rPr>
         <w:t xml:space="preserve">DIRECTION DES AFFAIRES FINANCIERES ET DU MATERIEL  </w:t>
@@ -224,9 +246,11 @@
       </w:pPr>
       <w:r>
         <w:rPr>
-          <w:b/>
-        </w:rPr>
-        <w:t xml:space="preserve">N°______/ENASTIC/DG/SG/DE/DAFM/2019                                       </w:t>
+          <w:sz w:val="20"/>
+          <w:szCs w:val="20"/>
+          <w:b/>
+        </w:rPr>
+        <w:t xml:space="preserve">N°______/ENASTIC/DG/SG/DE/DAFM/2026                                       </w:t>
       </w:r>
     </w:p>
     <w:p>
@@ -248,6 +272,10 @@
         <w:pStyle w:val="Titre1"/>
       </w:pPr>
       <w:r>
+        <w:rPr>
+          <w:sz w:val="20"/>
+          <w:szCs w:val="20"/>
+        </w:rPr>
         <w:t xml:space="preserve">CONTRAT DE VACATION </w:t>
       </w:r>
     </w:p>
@@ -257,6 +285,10 @@
         <w:jc w:val="center"/>
       </w:pPr>
       <w:r>
+        <w:rPr>
+          <w:sz w:val="20"/>
+          <w:szCs w:val="20"/>
+        </w:rPr>
         <w:t xml:space="preserve">Entre  </w:t>
       </w:r>
     </w:p>
@@ -268,6 +300,8 @@
       </w:pPr>
       <w:r>
         <w:rPr>
+          <w:sz w:val="20"/>
+          <w:szCs w:val="20"/>
           <w:b/>
         </w:rPr>
         <w:t xml:space="preserve">L’Ecole Nationale Supérieure des Technologies de l’Information et de la Communication (ENASTIC) </w:t>
@@ -281,10 +315,18 @@
       </w:pPr>
       <w:proofErr w:type="gramStart"/>
       <w:r>
+        <w:rPr>
+          <w:sz w:val="20"/>
+          <w:szCs w:val="20"/>
+        </w:rPr>
         <w:t>et</w:t>
       </w:r>
       <w:proofErr w:type="gramEnd"/>
       <w:r>
+        <w:rPr>
+          <w:sz w:val="20"/>
+          <w:szCs w:val="20"/>
+        </w:rPr>
         <w:t xml:space="preserve"> </w:t>
       </w:r>
     </w:p>
@@ -296,6 +338,10 @@
         <w:jc w:val="center"/>
       </w:pPr>
       <w:r>
+        <w:rPr>
+          <w:sz w:val="20"/>
+          <w:szCs w:val="20"/>
+        </w:rPr>
         <w:t>AAAA</w:t>
       </w:r>
     </w:p>
@@ -322,26 +368,40 @@
       </w:pPr>
       <w:r>
         <w:rPr>
+          <w:sz w:val="20"/>
+          <w:szCs w:val="20"/>
           <w:u w:val="single" w:color="000000"/>
         </w:rPr>
         <w:t>Article 1</w:t>
       </w:r>
       <w:r>
         <w:rPr>
+          <w:sz w:val="20"/>
+          <w:szCs w:val="20"/>
           <w:vertAlign w:val="superscript"/>
         </w:rPr>
         <w:t xml:space="preserve">er </w:t>
       </w:r>
       <w:r>
         <w:rPr>
+          <w:sz w:val="20"/>
+          <w:szCs w:val="20"/>
           <w:u w:val="single" w:color="000000"/>
         </w:rPr>
         <w:t xml:space="preserve">: </w:t>
       </w:r>
       <w:r>
+        <w:rPr>
+          <w:sz w:val="20"/>
+          <w:szCs w:val="20"/>
+        </w:rPr>
         <w:t xml:space="preserve">l’objet du présent contrat est de confier de vacation des enseignements à : </w:t>
       </w:r>
       <w:r>
+        <w:rPr>
+          <w:sz w:val="20"/>
+          <w:szCs w:val="20"/>
+        </w:rPr>
         <w:t>AAAA</w:t>
       </w:r>
     </w:p>
@@ -352,17 +412,31 @@
       </w:pPr>
       <w:proofErr w:type="gramStart"/>
       <w:r>
+        <w:rPr>
+          <w:sz w:val="20"/>
+          <w:szCs w:val="20"/>
+        </w:rPr>
         <w:t>en</w:t>
       </w:r>
       <w:proofErr w:type="gramEnd"/>
       <w:r>
+        <w:rPr>
+          <w:sz w:val="20"/>
+          <w:szCs w:val="20"/>
+        </w:rPr>
         <w:t xml:space="preserve"> qualité d</w:t>
       </w:r>
       <w:r>
+        <w:rPr>
+          <w:sz w:val="20"/>
+          <w:szCs w:val="20"/>
+        </w:rPr>
         <w:t xml:space="preserve">e : </w:t>
       </w:r>
       <w:r>
         <w:rPr>
+          <w:sz w:val="20"/>
+          <w:szCs w:val="20"/>
           <w:b/>
         </w:rPr>
         <w:t>BBBB</w:t>
@@ -370,68 +444,78 @@
     </w:p>
     <w:p>
       <w:pPr>
-        <w:spacing w:after="86" w:line="259" w:lineRule="auto"/>
-        <w:ind w:left="0" w:right="0" w:firstLine="0"/>
-      </w:pPr>
-      <w:r>
-        <w:rPr>
-          <w:sz w:val="12"/>
+        <w:ind w:left="-5" w:right="0"/>
+      </w:pPr>
+      <w:r>
+        <w:rPr>
+          <w:sz w:val="20"/>
+          <w:szCs w:val="20"/>
+          <w:b/>
+          <w:u w:val="single" w:color="000000"/>
+        </w:rPr>
+        <w:t>Article 2</w:t>
+      </w:r>
+      <w:r>
+        <w:rPr>
+          <w:sz w:val="20"/>
+          <w:szCs w:val="20"/>
+          <w:b/>
+          <w:vertAlign w:val="superscript"/>
         </w:rPr>
         <w:t xml:space="preserve"> </w:t>
       </w:r>
-    </w:p>
-    <w:p>
-      <w:pPr>
-        <w:ind w:left="-5" w:right="0"/>
-      </w:pPr>
-      <w:r>
-        <w:rPr>
+      <w:r>
+        <w:rPr>
+          <w:sz w:val="20"/>
+          <w:szCs w:val="20"/>
           <w:b/>
           <w:u w:val="single" w:color="000000"/>
         </w:rPr>
-        <w:t>Article 2</w:t>
-      </w:r>
-      <w:r>
-        <w:rPr>
-          <w:b/>
-          <w:vertAlign w:val="superscript"/>
+        <w:t xml:space="preserve">: </w:t>
+      </w:r>
+      <w:r>
+        <w:rPr>
+          <w:sz w:val="20"/>
+          <w:szCs w:val="20"/>
+        </w:rPr>
+        <w:t xml:space="preserve">l’Ecole Nationale Supérieure des Technologies de l’Information et de la Communication confie au vacataire pour l’année académique </w:t>
+      </w:r>
+      <w:r>
+        <w:rPr>
+          <w:sz w:val="20"/>
+          <w:szCs w:val="20"/>
         </w:rPr>
         <w:t xml:space="preserve"> </w:t>
       </w:r>
       <w:r>
         <w:rPr>
-          <w:b/>
-          <w:u w:val="single" w:color="000000"/>
-        </w:rPr>
-        <w:t xml:space="preserve">: </w:t>
-      </w:r>
-      <w:r>
-        <w:t xml:space="preserve">l’Ecole Nationale Supérieure des Technologies de l’Information et de la Communication confie au vacataire pour l’année académique </w:t>
-      </w:r>
-      <w:r>
+          <w:sz w:val="20"/>
+          <w:szCs w:val="20"/>
+          <w:b/>
+          <w:bCs/>
+        </w:rPr>
+        <w:t>CCCC</w:t>
+      </w:r>
+      <w:r>
+        <w:rPr>
+          <w:sz w:val="20"/>
+          <w:szCs w:val="20"/>
+          <w:b/>
+        </w:rPr>
         <w:t xml:space="preserve"> </w:t>
       </w:r>
       <w:r>
         <w:rPr>
-          <w:b/>
-          <w:bCs/>
-        </w:rPr>
-        <w:t>CCCC</w:t>
-      </w:r>
-      <w:r>
-        <w:rPr>
-          <w:b/>
-        </w:rPr>
-        <w:t xml:space="preserve"> </w:t>
-      </w:r>
-      <w:r>
+          <w:sz w:val="20"/>
+          <w:szCs w:val="20"/>
+        </w:rPr>
         <w:t xml:space="preserve">les heures d’enseignements suivantes : </w:t>
       </w:r>
     </w:p>
     <w:tbl>
       <w:tblPr>
         <w:tblStyle w:val="TableGrid"/>
-        <w:tblW w:w="10090" w:type="dxa"/>
+        <w:tblW w:w="9889" w:type="dxa"/>
         <w:tblInd w:w="-113" w:type="dxa"/>
         <w:tblCellMar>
           <w:top w:w="7" w:type="dxa"/>
@@ -444,7 +528,7 @@
         <w:gridCol w:w="4609"/>
         <w:gridCol w:w="1640"/>
         <w:gridCol w:w="1642"/>
-        <w:gridCol w:w="2199"/>
+        <w:gridCol w:w="1998"/>
       </w:tblGrid>
       <w:tr>
         <w:trPr>
@@ -527,7 +611,7 @@
         </w:tc>
         <w:tc>
           <w:tcPr>
-            <w:tcW w:w="2199" w:type="dxa"/>
+            <w:tcW w:w="1998" w:type="dxa"/>
             <w:tcBorders>
               <w:top w:val="single" w:sz="4" w:space="0" w:color="000000"/>
               <w:left w:val="single" w:sz="4" w:space="0" w:color="000000"/>
@@ -548,9 +632,6 @@
         </w:tc>
       </w:tr>
       <w:tr>
-        <w:trPr>
-          <w:trHeight w:val="276"/>
-        </w:trPr>
         <w:tc>
           <w:tcPr>
             <w:tcW w:w="4609" w:type="dxa"/>
@@ -568,35 +649,206 @@
               <w:jc w:val="center"/>
             </w:pPr>
             <w:r>
+              <w:t>AMMA</w:t>
+            </w:r>
+          </w:p>
+        </w:tc>
+        <w:tc>
+          <w:tcPr>
+            <w:tcW w:w="1640" w:type="dxa"/>
+            <w:tcBorders>
+              <w:top w:val="single" w:sz="4" w:space="0" w:color="000000"/>
+              <w:left w:val="single" w:sz="4" w:space="0" w:color="000000"/>
+              <w:bottom w:val="single" w:sz="4" w:space="0" w:color="000000"/>
+              <w:right w:val="single" w:sz="4" w:space="0" w:color="000000"/>
+            </w:tcBorders>
+          </w:tcPr>
+          <w:p>
+            <w:pPr>
+              <w:spacing w:after="0" w:line="259" w:lineRule="auto"/>
+              <w:ind w:left="2" w:right="0" w:firstLine="0"/>
+              <w:jc w:val="center"/>
+            </w:pPr>
+            <w:r>
+              <w:t>25</w:t>
+            </w:r>
+          </w:p>
+        </w:tc>
+        <w:tc>
+          <w:tcPr>
+            <w:tcW w:w="1642" w:type="dxa"/>
+            <w:tcBorders>
+              <w:top w:val="single" w:sz="4" w:space="0" w:color="000000"/>
+              <w:left w:val="single" w:sz="4" w:space="0" w:color="000000"/>
+              <w:bottom w:val="single" w:sz="4" w:space="0" w:color="000000"/>
+              <w:right w:val="single" w:sz="4" w:space="0" w:color="000000"/>
+            </w:tcBorders>
+          </w:tcPr>
+          <w:p>
+            <w:pPr>
+              <w:spacing w:after="0" w:line="259" w:lineRule="auto"/>
+              <w:ind w:left="3" w:right="0" w:firstLine="0"/>
+              <w:jc w:val="center"/>
+            </w:pPr>
+            <w:r>
+              <w:t>15</w:t>
+            </w:r>
+          </w:p>
+        </w:tc>
+        <w:tc>
+          <w:tcPr>
+            <w:tcW w:w="1998" w:type="dxa"/>
+            <w:tcBorders>
+              <w:top w:val="single" w:sz="4" w:space="0" w:color="000000"/>
+              <w:left w:val="single" w:sz="4" w:space="0" w:color="000000"/>
+              <w:bottom w:val="single" w:sz="4" w:space="0" w:color="000000"/>
+              <w:right w:val="single" w:sz="4" w:space="0" w:color="000000"/>
+            </w:tcBorders>
+          </w:tcPr>
+          <w:p>
+            <w:pPr>
+              <w:spacing w:after="0" w:line="259" w:lineRule="auto"/>
+              <w:ind w:left="0" w:right="2" w:firstLine="0"/>
+              <w:jc w:val="center"/>
+            </w:pPr>
+            <w:r>
+              <w:t>10</w:t>
+            </w:r>
+          </w:p>
+        </w:tc>
+      </w:tr>
+      <w:tr>
+        <w:tc>
+          <w:tcPr>
+            <w:tcW w:w="4609" w:type="dxa"/>
+            <w:tcBorders>
+              <w:top w:val="single" w:sz="4" w:space="0" w:color="000000"/>
+              <w:left w:val="single" w:sz="4" w:space="0" w:color="000000"/>
+              <w:bottom w:val="single" w:sz="4" w:space="0" w:color="000000"/>
+              <w:right w:val="single" w:sz="4" w:space="0" w:color="000000"/>
+            </w:tcBorders>
+          </w:tcPr>
+          <w:p>
+            <w:pPr>
+              <w:spacing w:after="0" w:line="259" w:lineRule="auto"/>
+              <w:ind w:left="0" w:right="5" w:firstLine="0"/>
+              <w:jc w:val="center"/>
+            </w:pPr>
+            <w:r>
+              <w:t>Eyfikefike</w:t>
+            </w:r>
+          </w:p>
+        </w:tc>
+        <w:tc>
+          <w:tcPr>
+            <w:tcW w:w="1640" w:type="dxa"/>
+            <w:tcBorders>
+              <w:top w:val="single" w:sz="4" w:space="0" w:color="000000"/>
+              <w:left w:val="single" w:sz="4" w:space="0" w:color="000000"/>
+              <w:bottom w:val="single" w:sz="4" w:space="0" w:color="000000"/>
+              <w:right w:val="single" w:sz="4" w:space="0" w:color="000000"/>
+            </w:tcBorders>
+          </w:tcPr>
+          <w:p>
+            <w:pPr>
+              <w:spacing w:after="0" w:line="259" w:lineRule="auto"/>
+              <w:ind w:left="2" w:right="0" w:firstLine="0"/>
+              <w:jc w:val="center"/>
+            </w:pPr>
+            <w:r>
+              <w:t>10</w:t>
+            </w:r>
+          </w:p>
+        </w:tc>
+        <w:tc>
+          <w:tcPr>
+            <w:tcW w:w="1642" w:type="dxa"/>
+            <w:tcBorders>
+              <w:top w:val="single" w:sz="4" w:space="0" w:color="000000"/>
+              <w:left w:val="single" w:sz="4" w:space="0" w:color="000000"/>
+              <w:bottom w:val="single" w:sz="4" w:space="0" w:color="000000"/>
+              <w:right w:val="single" w:sz="4" w:space="0" w:color="000000"/>
+            </w:tcBorders>
+          </w:tcPr>
+          <w:p>
+            <w:pPr>
+              <w:spacing w:after="0" w:line="259" w:lineRule="auto"/>
+              <w:ind w:left="3" w:right="0" w:firstLine="0"/>
+              <w:jc w:val="center"/>
+            </w:pPr>
+            <w:r>
+              <w:t>18</w:t>
+            </w:r>
+          </w:p>
+        </w:tc>
+        <w:tc>
+          <w:tcPr>
+            <w:tcW w:w="1998" w:type="dxa"/>
+            <w:tcBorders>
+              <w:top w:val="single" w:sz="4" w:space="0" w:color="000000"/>
+              <w:left w:val="single" w:sz="4" w:space="0" w:color="000000"/>
+              <w:bottom w:val="single" w:sz="4" w:space="0" w:color="000000"/>
+              <w:right w:val="single" w:sz="4" w:space="0" w:color="000000"/>
+            </w:tcBorders>
+          </w:tcPr>
+          <w:p>
+            <w:pPr>
+              <w:spacing w:after="0" w:line="259" w:lineRule="auto"/>
+              <w:ind w:left="0" w:right="2" w:firstLine="0"/>
+              <w:jc w:val="center"/>
+            </w:pPr>
+            <w:r>
+              <w:t>0</w:t>
+            </w:r>
+          </w:p>
+        </w:tc>
+      </w:tr>
+      <w:tr>
+        <w:tc>
+          <w:tcPr>
+            <w:tcW w:w="4609" w:type="dxa"/>
+            <w:tcBorders>
+              <w:top w:val="single" w:sz="4" w:space="0" w:color="000000"/>
+              <w:left w:val="single" w:sz="4" w:space="0" w:color="000000"/>
+              <w:bottom w:val="single" w:sz="4" w:space="0" w:color="000000"/>
+              <w:right w:val="single" w:sz="4" w:space="0" w:color="000000"/>
+            </w:tcBorders>
+          </w:tcPr>
+          <w:p>
+            <w:pPr>
+              <w:spacing w:after="0" w:line="259" w:lineRule="auto"/>
+              <w:ind w:left="0" w:right="5" w:firstLine="0"/>
+              <w:jc w:val="center"/>
               <w:rPr>
                 <w:b/>
+                <w:bCs/>
               </w:rPr>
-              <w:t xml:space="preserve">Réseaux informatiques (L2 Télécoms) </w:t>
-            </w:r>
-          </w:p>
-        </w:tc>
-        <w:tc>
-          <w:tcPr>
-            <w:tcW w:w="1640" w:type="dxa"/>
-            <w:tcBorders>
-              <w:top w:val="single" w:sz="4" w:space="0" w:color="000000"/>
-              <w:left w:val="single" w:sz="4" w:space="0" w:color="000000"/>
-              <w:bottom w:val="single" w:sz="4" w:space="0" w:color="000000"/>
-              <w:right w:val="single" w:sz="4" w:space="0" w:color="000000"/>
-            </w:tcBorders>
-          </w:tcPr>
-          <w:p>
-            <w:pPr>
-              <w:spacing w:after="0" w:line="259" w:lineRule="auto"/>
-              <w:ind w:left="2" w:right="0" w:firstLine="0"/>
-              <w:jc w:val="center"/>
             </w:pPr>
             <w:r>
               <w:rPr>
                 <w:b/>
+                <w:bCs/>
               </w:rPr>
-              <w:t xml:space="preserve">28 </w:t>
-            </w:r>
+              <w:t>Total</w:t>
+            </w:r>
+          </w:p>
+        </w:tc>
+        <w:tc>
+          <w:tcPr>
+            <w:tcW w:w="1640" w:type="dxa"/>
+            <w:tcBorders>
+              <w:top w:val="single" w:sz="4" w:space="0" w:color="000000"/>
+              <w:left w:val="single" w:sz="4" w:space="0" w:color="000000"/>
+              <w:bottom w:val="single" w:sz="4" w:space="0" w:color="000000"/>
+              <w:right w:val="single" w:sz="4" w:space="0" w:color="000000"/>
+            </w:tcBorders>
+          </w:tcPr>
+          <w:p>
+            <w:pPr>
+              <w:spacing w:after="0" w:line="259" w:lineRule="auto"/>
+              <w:ind w:left="2" w:right="0" w:firstLine="0"/>
+              <w:jc w:val="center"/>
+            </w:pPr>
           </w:p>
         </w:tc>
         <w:tc>
@@ -615,17 +867,11 @@
               <w:ind w:left="3" w:right="0" w:firstLine="0"/>
               <w:jc w:val="center"/>
             </w:pPr>
-            <w:r>
-              <w:rPr>
-                <w:b/>
-              </w:rPr>
-              <w:t xml:space="preserve">8 </w:t>
-            </w:r>
-          </w:p>
-        </w:tc>
-        <w:tc>
-          <w:tcPr>
-            <w:tcW w:w="2199" w:type="dxa"/>
+          </w:p>
+        </w:tc>
+        <w:tc>
+          <w:tcPr>
+            <w:tcW w:w="1998" w:type="dxa"/>
             <w:tcBorders>
               <w:top w:val="single" w:sz="4" w:space="0" w:color="000000"/>
               <w:left w:val="single" w:sz="4" w:space="0" w:color="000000"/>
@@ -639,49 +885,43 @@
               <w:ind w:left="0" w:right="2" w:firstLine="0"/>
               <w:jc w:val="center"/>
             </w:pPr>
-            <w:r>
-              <w:rPr>
-                <w:b/>
-              </w:rPr>
-              <w:t xml:space="preserve">6 </w:t>
-            </w:r>
           </w:p>
         </w:tc>
       </w:tr>
     </w:tbl>
     <w:p>
       <w:pPr>
-        <w:spacing w:after="100" w:line="259" w:lineRule="auto"/>
-        <w:ind w:left="0" w:right="0" w:firstLine="0"/>
-      </w:pPr>
-      <w:r>
-        <w:rPr>
-          <w:sz w:val="12"/>
-        </w:rPr>
-        <w:t xml:space="preserve"> </w:t>
-      </w:r>
-    </w:p>
-    <w:p>
-      <w:pPr>
         <w:ind w:left="-5" w:right="0"/>
       </w:pPr>
       <w:r>
         <w:rPr>
+          <w:sz w:val="20"/>
+          <w:szCs w:val="20"/>
           <w:b/>
           <w:u w:val="single" w:color="000000"/>
         </w:rPr>
         <w:t>Article 3 :</w:t>
       </w:r>
       <w:r>
+        <w:rPr>
+          <w:sz w:val="20"/>
+          <w:szCs w:val="20"/>
+        </w:rPr>
         <w:t xml:space="preserve"> les taux horaires de vacation sont fixés par </w:t>
       </w:r>
       <w:r>
         <w:rPr>
+          <w:sz w:val="20"/>
+          <w:szCs w:val="20"/>
           <w:rFonts w:ascii="Open Sans" w:eastAsia="Open Sans" w:hAnsi="Open Sans" w:cs="Open Sans"/>
         </w:rPr>
         <w:t>l’Arrêté N°052/PM/2000</w:t>
       </w:r>
       <w:r>
+        <w:rPr>
+          <w:sz w:val="20"/>
+          <w:szCs w:val="20"/>
+        </w:rPr>
         <w:t xml:space="preserve">, applicables aux enseignants permanents et vacataires. </w:t>
       </w:r>
     </w:p>
@@ -922,6 +1162,7 @@
               <w:bottom w:val="single" w:sz="4" w:space="0" w:color="000000"/>
               <w:right w:val="single" w:sz="4" w:space="0" w:color="000000"/>
             </w:tcBorders>
+            <w:shd w:val="clear" w:color="auto" w:fill="FFFF00"/>
           </w:tcPr>
           <w:p>
             <w:pPr>
@@ -946,6 +1187,7 @@
               <w:bottom w:val="single" w:sz="4" w:space="0" w:color="000000"/>
               <w:right w:val="single" w:sz="4" w:space="0" w:color="000000"/>
             </w:tcBorders>
+            <w:shd w:val="clear" w:color="auto" w:fill="FFFF00"/>
           </w:tcPr>
           <w:p>
             <w:pPr>
@@ -970,6 +1212,7 @@
               <w:bottom w:val="single" w:sz="4" w:space="0" w:color="000000"/>
               <w:right w:val="single" w:sz="4" w:space="0" w:color="000000"/>
             </w:tcBorders>
+            <w:shd w:val="clear" w:color="auto" w:fill="FFFF00"/>
           </w:tcPr>
           <w:p>
             <w:pPr>
@@ -994,6 +1237,7 @@
               <w:bottom w:val="single" w:sz="4" w:space="0" w:color="000000"/>
               <w:right w:val="single" w:sz="4" w:space="0" w:color="000000"/>
             </w:tcBorders>
+            <w:shd w:val="clear" w:color="auto" w:fill="FFFF00"/>
           </w:tcPr>
           <w:p>
             <w:pPr>
@@ -1332,23 +1576,13 @@
     </w:tbl>
     <w:p>
       <w:pPr>
-        <w:spacing w:after="0" w:line="259" w:lineRule="auto"/>
-        <w:ind w:left="0" w:right="0" w:firstLine="0"/>
-      </w:pPr>
-      <w:r>
-        <w:rPr>
-          <w:sz w:val="14"/>
-        </w:rPr>
-        <w:t xml:space="preserve"> </w:t>
-      </w:r>
-    </w:p>
-    <w:p>
-      <w:pPr>
         <w:spacing w:after="34"/>
         <w:ind w:left="-5" w:right="0"/>
       </w:pPr>
       <w:r>
         <w:rPr>
+          <w:sz w:val="20"/>
+          <w:szCs w:val="20"/>
           <w:b/>
           <w:u w:val="single" w:color="000000"/>
         </w:rPr>
@@ -1356,6 +1590,8 @@
       </w:r>
       <w:r>
         <w:rPr>
+          <w:sz w:val="20"/>
+          <w:szCs w:val="20"/>
           <w:b/>
           <w:vertAlign w:val="superscript"/>
         </w:rPr>
@@ -1363,12 +1599,18 @@
       </w:r>
       <w:r>
         <w:rPr>
+          <w:sz w:val="20"/>
+          <w:szCs w:val="20"/>
           <w:b/>
           <w:u w:val="single" w:color="000000"/>
         </w:rPr>
         <w:t xml:space="preserve">: </w:t>
       </w:r>
       <w:r>
+        <w:rPr>
+          <w:sz w:val="20"/>
+          <w:szCs w:val="20"/>
+        </w:rPr>
         <w:t xml:space="preserve">outre les enseignements qu’il assure, le vacataire doit sans aucune rémunération : </w:t>
       </w:r>
     </w:p>
@@ -1382,18 +1624,34 @@
       </w:pPr>
       <w:proofErr w:type="gramStart"/>
       <w:r>
+        <w:rPr>
+          <w:sz w:val="20"/>
+          <w:szCs w:val="20"/>
+        </w:rPr>
         <w:t>assurer</w:t>
       </w:r>
       <w:proofErr w:type="gramEnd"/>
       <w:r>
+        <w:rPr>
+          <w:sz w:val="20"/>
+          <w:szCs w:val="20"/>
+        </w:rPr>
         <w:t xml:space="preserve"> la surveillance des contrôles continus des connaissances et examens ainsi que l’évaluation des </w:t>
       </w:r>
       <w:proofErr w:type="gramStart"/>
       <w:r>
+        <w:rPr>
+          <w:sz w:val="20"/>
+          <w:szCs w:val="20"/>
+        </w:rPr>
         <w:t>étudiants;</w:t>
       </w:r>
       <w:proofErr w:type="gramEnd"/>
       <w:r>
+        <w:rPr>
+          <w:sz w:val="20"/>
+          <w:szCs w:val="20"/>
+        </w:rPr>
         <w:t xml:space="preserve"> </w:t>
       </w:r>
     </w:p>
@@ -1406,47 +1664,49 @@
         <w:ind w:right="0" w:hanging="360"/>
       </w:pPr>
       <w:r>
+        <w:rPr>
+          <w:sz w:val="20"/>
+          <w:szCs w:val="20"/>
+        </w:rPr>
         <w:t xml:space="preserve">participer aux délibérations du jury des examens. </w:t>
       </w:r>
     </w:p>
     <w:p>
       <w:pPr>
-        <w:spacing w:after="160" w:line="259" w:lineRule="auto"/>
-        <w:ind w:left="1020" w:right="0" w:firstLine="0"/>
-      </w:pPr>
-      <w:r>
-        <w:rPr>
-          <w:sz w:val="16"/>
+        <w:ind w:left="-5" w:right="0"/>
+      </w:pPr>
+      <w:r>
+        <w:rPr>
+          <w:sz w:val="20"/>
+          <w:szCs w:val="20"/>
+          <w:b/>
+          <w:u w:val="single" w:color="000000"/>
+        </w:rPr>
+        <w:t>Article 5</w:t>
+      </w:r>
+      <w:r>
+        <w:rPr>
+          <w:sz w:val="20"/>
+          <w:szCs w:val="20"/>
+          <w:b/>
+          <w:vertAlign w:val="superscript"/>
         </w:rPr>
         <w:t xml:space="preserve"> </w:t>
       </w:r>
-    </w:p>
-    <w:p>
-      <w:pPr>
-        <w:ind w:left="-5" w:right="0"/>
-      </w:pPr>
-      <w:r>
-        <w:rPr>
+      <w:r>
+        <w:rPr>
+          <w:sz w:val="20"/>
+          <w:szCs w:val="20"/>
           <w:b/>
           <w:u w:val="single" w:color="000000"/>
         </w:rPr>
-        <w:t>Article 5</w:t>
-      </w:r>
-      <w:r>
-        <w:rPr>
-          <w:b/>
-          <w:vertAlign w:val="superscript"/>
-        </w:rPr>
-        <w:t xml:space="preserve"> </w:t>
-      </w:r>
-      <w:r>
-        <w:rPr>
-          <w:b/>
-          <w:u w:val="single" w:color="000000"/>
-        </w:rPr>
         <w:t>:</w:t>
       </w:r>
       <w:r>
+        <w:rPr>
+          <w:sz w:val="20"/>
+          <w:szCs w:val="20"/>
+        </w:rPr>
         <w:t xml:space="preserve"> le vacataire et l’Ecole Nationale Supérieure des Technologies de l’Information et de la Communication sont tenus chacun en ce qui le concerne au respect des textes en vigueur. </w:t>
       </w:r>
     </w:p>
@@ -1460,6 +1720,54 @@
           <w:sz w:val="18"/>
         </w:rPr>
         <w:t xml:space="preserve"> </w:t>
+      </w:r>
+    </w:p>
+    <w:p>
+      <w:pPr>
+        <w:tabs>
+          <w:tab w:val="left" w:pos="3496"/>
+          <w:tab w:val="right" w:pos="7937"/>
+        </w:tabs>
+        <w:spacing w:after="120" w:line="259" w:lineRule="auto"/>
+        <w:ind w:left="0" w:right="0" w:firstLine="0"/>
+      </w:pPr>
+      <w:r>
+        <w:rPr>
+          <w:sz w:val="20"/>
+          <w:szCs w:val="20"/>
+          <w:b/>
+        </w:rPr>
+        <w:t>Le Vacataire</w:t>
+      </w:r>
+      <w:r>
+        <w:rPr>
+          <w:sz w:val="20"/>
+          <w:szCs w:val="20"/>
+        </w:rPr>
+        <w:tab/>
+      </w:r>
+      <w:r>
+        <w:rPr>
+          <w:sz w:val="20"/>
+          <w:szCs w:val="20"/>
+        </w:rPr>
+        <w:t xml:space="preserve">                           </w:t>
+      </w:r>
+      <w:r>
+        <w:rPr>
+          <w:sz w:val="20"/>
+          <w:szCs w:val="20"/>
+        </w:rPr>
+        <w:tab/>
+        <w:t xml:space="preserve">    </w:t>
+      </w:r>
+      <w:r>
+        <w:rPr>
+          <w:sz w:val="20"/>
+          <w:szCs w:val="20"/>
+          <w:b/>
+        </w:rPr>
+        <w:t>Le Directeur Général de l’ENASTIC</w:t>
       </w:r>
     </w:p>
     <w:p>
@@ -1468,15 +1776,6 @@
         <w:ind w:right="7"/>
         <w:jc w:val="center"/>
       </w:pPr>
-      <w:r>
-        <w:rPr>
-          <w:i/>
-        </w:rPr>
-        <w:t>Le Vacataire                                                                                         Le Directeur Général de l’ENASTIC</w:t>
-      </w:r>
-      <w:r>
-        <w:t xml:space="preserve"> </w:t>
-      </w:r>
     </w:p>
     <w:p>
       <w:pPr>
@@ -1495,29 +1794,111 @@
     <w:p>
       <w:pPr>
         <w:spacing w:after="120" w:line="259" w:lineRule="auto"/>
-        <w:ind w:right="7"/>
-        <w:jc w:val="center"/>
-      </w:pPr>
-      <w:r>
-        <w:t xml:space="preserve">AAAA                                                                                                      </w:t>
-      </w:r>
-      <w:r>
-        <w:rPr>
-          <w:b/>
-        </w:rPr>
-        <w:t xml:space="preserve">  </w:t>
-      </w:r>
-      <w:r>
-        <w:rPr>
-          <w:b/>
-          <w:u w:val="single" w:color="000000"/>
+        <w:ind w:left="0" w:right="7" w:firstLine="0"/>
+      </w:pPr>
+    </w:p>
+    <w:p>
+      <w:pPr>
+        <w:tabs>
+          <w:tab w:val="left" w:pos="2602"/>
+          <w:tab w:val="right" w:pos="7937"/>
+        </w:tabs>
+        <w:spacing w:after="120" w:line="259" w:lineRule="auto"/>
+        <w:ind w:left="0" w:right="0" w:firstLine="0"/>
+      </w:pPr>
+      <w:r>
+        <w:rPr>
+          <w:sz w:val="20"/>
+          <w:szCs w:val="20"/>
+          <w:b/>
+          <w:u w:val="single"/>
+        </w:rPr>
+        <w:t>AAAA</w:t>
+      </w:r>
+      <w:r>
+        <w:rPr>
+          <w:sz w:val="20"/>
+          <w:szCs w:val="20"/>
+        </w:rPr>
+        <w:tab/>
+        <w:t xml:space="preserve">                                                  </w:t>
+      </w:r>
+      <w:r>
+        <w:rPr>
+          <w:sz w:val="20"/>
+          <w:szCs w:val="20"/>
+          <w:b/>
+          <w:u w:val="single"/>
         </w:rPr>
         <w:t>Dr HAGGAR BACHAR SALIM</w:t>
+      </w:r>
+    </w:p>
+    <w:p>
+      <w:pPr>
+        <w:spacing w:before="240" w:after="0"/>
+        <w:ind w:left="0" w:firstLine="0"/>
+      </w:pPr>
+      <w:r>
+        <w:rPr>
+          <w:noProof/>
+        </w:rPr>
+        <w:drawing>
+          <wp:anchor distT="0" distB="0" distL="114300" distR="114300" simplePos="0" relativeHeight="251660288" behindDoc="0" locked="0" layoutInCell="1" allowOverlap="1" wp14:anchorId="2CBACD19" wp14:editId="47E4E4E6">
+            <wp:simplePos x="897875" y="9777470"/>
+            <wp:positionH relativeFrom="column">
+              <wp:align>left</wp:align>
+            </wp:positionH>
+            <wp:positionV relativeFrom="paragraph">
+              <wp:align>top</wp:align>
+            </wp:positionV>
+            <wp:extent cx="288000" cy="288000"/>
+            <wp:effectExtent l="0" t="0" r="4445" b="4445"/>
+            <wp:wrapSquare wrapText="bothSides"/>
+            <wp:docPr id="11030" name="Picture 11030"/>
+            <wp:cNvGraphicFramePr>
+              <a:graphicFrameLocks xmlns:a="http://schemas.openxmlformats.org/drawingml/2006/main" noChangeAspect="1"/>
+            </wp:cNvGraphicFramePr>
+            <a:graphic xmlns:a="http://schemas.openxmlformats.org/drawingml/2006/main">
+              <a:graphicData uri="http://schemas.openxmlformats.org/drawingml/2006/picture">
+                <pic:pic xmlns:pic="http://schemas.openxmlformats.org/drawingml/2006/picture">
+                  <pic:nvPicPr>
+                    <pic:cNvPr id="0" name="tmprnsyhm__.png"/>
+                    <pic:cNvPicPr/>
+                  </pic:nvPicPr>
+                  <pic:blipFill>
+                    <a:blip r:embed="rId8" cstate="print">
+                      <a:extLst>
+                        <a:ext uri="{28A0092B-C50C-407E-A947-70E740481C1C}">
+                          <a14:useLocalDpi xmlns:a14="http://schemas.microsoft.com/office/drawing/2010/main" val="0"/>
+                        </a:ext>
+                      </a:extLst>
+                    </a:blip>
+                    <a:stretch>
+                      <a:fillRect/>
+                    </a:stretch>
+                  </pic:blipFill>
+                  <pic:spPr>
+                    <a:xfrm>
+                      <a:off x="0" y="0"/>
+                      <a:ext cx="288000" cy="288000"/>
+                    </a:xfrm>
+                    <a:prstGeom prst="rect">
+                      <a:avLst/>
+                    </a:prstGeom>
+                  </pic:spPr>
+                </pic:pic>
+              </a:graphicData>
+            </a:graphic>
+          </wp:anchor>
+        </w:drawing>
+      </w:r>
+      <w:r>
+        <w:br w:type="textWrapping" w:clear="all"/>
       </w:r>
     </w:p>
     <w:sectPr>
       <w:pgSz w:w="11906" w:h="16838"/>
-      <w:pgMar w:top="857" w:right="1417" w:bottom="1417" w:left="1417" w:header="336" w:footer="708" w:gutter="0"/>
+      <w:pgMar w:top="857" w:right="1417" w:bottom="680" w:left="1417" w:header="336" w:footer="340" w:gutter="0"/>
       <w:cols w:space="708"/>
       <w:docGrid w:linePitch="360"/>
     </w:sectPr>

</xml_diff>